<commit_message>
Clean reports and add spatial join workflow
</commit_message>
<xml_diff>
--- a/Individual_Project_Report_RL.docx
+++ b/Individual_Project_Report_RL.docx
@@ -21,9 +21,11 @@
           <w:numId w:val="1"/>
         </w:numPr>
       </w:pPr>
+      <w:proofErr w:type="spellStart"/>
       <w:r>
         <w:t>Introduction</w:t>
       </w:r>
+      <w:proofErr w:type="spellEnd"/>
     </w:p>
     <w:p>
       <w:r>
@@ -38,8 +40,13 @@
           <w:numId w:val="2"/>
         </w:numPr>
       </w:pPr>
-      <w:r>
-        <w:t>Züri wie neu</w:t>
+      <w:proofErr w:type="spellStart"/>
+      <w:r>
+        <w:t>Züri</w:t>
+      </w:r>
+      <w:proofErr w:type="spellEnd"/>
+      <w:r>
+        <w:t xml:space="preserve"> wie neu</w:t>
       </w:r>
       <w:r>
         <w:rPr>
@@ -48,8 +55,29 @@
         </w:rPr>
         <w:t xml:space="preserve"> </w:t>
       </w:r>
-      <w:r>
-        <w:t>Comma Separated Values (.csv)</w:t>
+      <w:proofErr w:type="spellStart"/>
+      <w:r>
+        <w:t>Comma</w:t>
+      </w:r>
+      <w:proofErr w:type="spellEnd"/>
+      <w:r>
+        <w:t xml:space="preserve"> </w:t>
+      </w:r>
+      <w:proofErr w:type="spellStart"/>
+      <w:r>
+        <w:t>Separated</w:t>
+      </w:r>
+      <w:proofErr w:type="spellEnd"/>
+      <w:r>
+        <w:t xml:space="preserve"> Values (.</w:t>
+      </w:r>
+      <w:proofErr w:type="spellStart"/>
+      <w:r>
+        <w:t>csv</w:t>
+      </w:r>
+      <w:proofErr w:type="spellEnd"/>
+      <w:r>
+        <w:t>)</w:t>
       </w:r>
       <w:r>
         <w:t xml:space="preserve"> im EPSG: 2056</w:t>
@@ -64,7 +92,23 @@
         </w:numPr>
       </w:pPr>
       <w:r>
-        <w:t>Statistische Quartiere Geopackage (.gpkg)</w:t>
+        <w:t xml:space="preserve">Statistische Quartiere </w:t>
+      </w:r>
+      <w:proofErr w:type="spellStart"/>
+      <w:r>
+        <w:t>Geopackage</w:t>
+      </w:r>
+      <w:proofErr w:type="spellEnd"/>
+      <w:r>
+        <w:t xml:space="preserve"> (.</w:t>
+      </w:r>
+      <w:proofErr w:type="spellStart"/>
+      <w:r>
+        <w:t>gpkg</w:t>
+      </w:r>
+      <w:proofErr w:type="spellEnd"/>
+      <w:r>
+        <w:t>)</w:t>
       </w:r>
       <w:r>
         <w:t xml:space="preserve"> </w:t>
@@ -74,8 +118,13 @@
       </w:r>
     </w:p>
     <w:p>
-      <w:r>
-        <w:t>Welche Datum behalten:</w:t>
+      <w:proofErr w:type="gramStart"/>
+      <w:r>
+        <w:t>Welche Datum</w:t>
+      </w:r>
+      <w:proofErr w:type="gramEnd"/>
+      <w:r>
+        <w:t xml:space="preserve"> behalten:</w:t>
       </w:r>
     </w:p>
     <w:p>
@@ -135,7 +184,23 @@
         <w:t xml:space="preserve"> nich</w:t>
       </w:r>
       <w:r>
-        <w:t>t, da e sgenau das selbe aussagt</w:t>
+        <w:t xml:space="preserve">t, da e </w:t>
+      </w:r>
+      <w:proofErr w:type="spellStart"/>
+      <w:r>
+        <w:t>sgenau</w:t>
+      </w:r>
+      <w:proofErr w:type="spellEnd"/>
+      <w:r>
+        <w:t xml:space="preserve"> </w:t>
+      </w:r>
+      <w:proofErr w:type="gramStart"/>
+      <w:r>
+        <w:t>das selbe</w:t>
+      </w:r>
+      <w:proofErr w:type="gramEnd"/>
+      <w:r>
+        <w:t xml:space="preserve"> aussagt</w:t>
       </w:r>
     </w:p>
     <w:p>
@@ -159,7 +224,187 @@
         <w:t>Workflow and Implementation</w:t>
       </w:r>
     </w:p>
-    <w:p/>
+    <w:p>
+      <w:pPr>
+        <w:pStyle w:val="Listenabsatz"/>
+        <w:numPr>
+          <w:ilvl w:val="0"/>
+          <w:numId w:val="2"/>
+        </w:numPr>
+      </w:pPr>
+      <w:proofErr w:type="gramStart"/>
+      <w:r>
+        <w:t>Habe</w:t>
+      </w:r>
+      <w:proofErr w:type="gramEnd"/>
+      <w:r>
+        <w:t xml:space="preserve"> den </w:t>
+      </w:r>
+      <w:proofErr w:type="spellStart"/>
+      <w:r>
+        <w:t>spatila</w:t>
+      </w:r>
+      <w:proofErr w:type="spellEnd"/>
+      <w:r>
+        <w:t xml:space="preserve"> </w:t>
+      </w:r>
+      <w:proofErr w:type="spellStart"/>
+      <w:r>
+        <w:t>join</w:t>
+      </w:r>
+      <w:proofErr w:type="spellEnd"/>
+      <w:r>
+        <w:t xml:space="preserve"> gemacht, aber erst dann </w:t>
+      </w:r>
+      <w:proofErr w:type="spellStart"/>
+      <w:r>
+        <w:t>ebrmekrt</w:t>
+      </w:r>
+      <w:proofErr w:type="spellEnd"/>
+      <w:r>
+        <w:t xml:space="preserve"> das ich das </w:t>
+      </w:r>
+      <w:proofErr w:type="spellStart"/>
+      <w:r>
+        <w:t>dataset</w:t>
+      </w:r>
+      <w:proofErr w:type="spellEnd"/>
+      <w:r>
+        <w:t xml:space="preserve"> gar nicht </w:t>
+      </w:r>
+      <w:proofErr w:type="spellStart"/>
+      <w:r>
+        <w:t>angeshcaut</w:t>
+      </w:r>
+      <w:proofErr w:type="spellEnd"/>
+      <w:r>
+        <w:t xml:space="preserve"> habe, </w:t>
+      </w:r>
+      <w:proofErr w:type="spellStart"/>
+      <w:r>
+        <w:t>dh</w:t>
+      </w:r>
+      <w:proofErr w:type="spellEnd"/>
+      <w:r>
+        <w:t xml:space="preserve"> musste nochmals zurück vor dem </w:t>
+      </w:r>
+      <w:proofErr w:type="spellStart"/>
+      <w:r>
+        <w:t>join</w:t>
+      </w:r>
+      <w:proofErr w:type="spellEnd"/>
+      <w:r>
+        <w:t xml:space="preserve"> und wahrscheinlich auch das </w:t>
+      </w:r>
+      <w:proofErr w:type="spellStart"/>
+      <w:r>
+        <w:t>polgyon</w:t>
+      </w:r>
+      <w:proofErr w:type="spellEnd"/>
+      <w:r>
+        <w:t xml:space="preserve"> </w:t>
+      </w:r>
+      <w:proofErr w:type="spellStart"/>
+      <w:r>
+        <w:t>dataset</w:t>
+      </w:r>
+      <w:proofErr w:type="spellEnd"/>
+      <w:r>
+        <w:t xml:space="preserve"> cleanen</w:t>
+      </w:r>
+    </w:p>
+    <w:p>
+      <w:pPr>
+        <w:pStyle w:val="Listenabsatz"/>
+        <w:numPr>
+          <w:ilvl w:val="0"/>
+          <w:numId w:val="2"/>
+        </w:numPr>
+      </w:pPr>
+      <w:proofErr w:type="gramStart"/>
+      <w:r>
+        <w:t>Habe</w:t>
+      </w:r>
+      <w:proofErr w:type="gramEnd"/>
+      <w:r>
+        <w:t xml:space="preserve"> realisiert, dass ich </w:t>
+      </w:r>
+      <w:proofErr w:type="spellStart"/>
+      <w:r>
+        <w:t>zeurst</w:t>
+      </w:r>
+      <w:proofErr w:type="spellEnd"/>
+      <w:r>
+        <w:t xml:space="preserve"> das punkt </w:t>
+      </w:r>
+      <w:proofErr w:type="spellStart"/>
+      <w:r>
+        <w:t>dataset</w:t>
+      </w:r>
+      <w:proofErr w:type="spellEnd"/>
+      <w:r>
+        <w:t xml:space="preserve"> reingeladen habe von den 34 kreisen,</w:t>
+      </w:r>
+      <w:r>
+        <w:t xml:space="preserve"> danach habe ich den richtigen </w:t>
+      </w:r>
+      <w:proofErr w:type="spellStart"/>
+      <w:r>
+        <w:t>layer</w:t>
+      </w:r>
+      <w:proofErr w:type="spellEnd"/>
+      <w:r>
+        <w:t xml:space="preserve"> reingeladen und mit </w:t>
+      </w:r>
+      <w:proofErr w:type="spellStart"/>
+      <w:r>
+        <w:t>dme</w:t>
+      </w:r>
+      <w:proofErr w:type="spellEnd"/>
+      <w:r>
+        <w:t xml:space="preserve"> den </w:t>
+      </w:r>
+      <w:proofErr w:type="spellStart"/>
+      <w:r>
+        <w:t>spatial</w:t>
+      </w:r>
+      <w:proofErr w:type="spellEnd"/>
+      <w:r>
+        <w:t xml:space="preserve"> </w:t>
+      </w:r>
+      <w:proofErr w:type="spellStart"/>
+      <w:r>
+        <w:t>join</w:t>
+      </w:r>
+      <w:proofErr w:type="spellEnd"/>
+      <w:r>
+        <w:t xml:space="preserve"> gemacht</w:t>
+      </w:r>
+    </w:p>
+    <w:p>
+      <w:pPr>
+        <w:pStyle w:val="Listenabsatz"/>
+        <w:numPr>
+          <w:ilvl w:val="1"/>
+          <w:numId w:val="2"/>
+        </w:numPr>
+        <w:rPr>
+          <w:color w:val="EE0000"/>
+        </w:rPr>
+      </w:pPr>
+      <w:r>
+        <w:rPr>
+          <w:color w:val="EE0000"/>
+        </w:rPr>
+        <w:t xml:space="preserve">Cleanen der Namen und droppen der unnötigen </w:t>
+      </w:r>
+      <w:r>
+        <w:rPr>
+          <w:color w:val="EE0000"/>
+        </w:rPr>
+        <w:t>Colums?</w:t>
+      </w:r>
+    </w:p>
     <w:p>
       <w:pPr>
         <w:pStyle w:val="Listenabsatz"/>
@@ -168,9 +413,11 @@
           <w:numId w:val="1"/>
         </w:numPr>
       </w:pPr>
+      <w:proofErr w:type="spellStart"/>
       <w:r>
         <w:t>Results</w:t>
       </w:r>
+      <w:proofErr w:type="spellEnd"/>
     </w:p>
     <w:p/>
     <w:p>
@@ -182,8 +429,13 @@
         </w:numPr>
       </w:pPr>
       <w:r>
-        <w:t>Challenge and Reflection</w:t>
-      </w:r>
+        <w:t xml:space="preserve">Challenge and </w:t>
+      </w:r>
+      <w:proofErr w:type="spellStart"/>
+      <w:r>
+        <w:t>Reflection</w:t>
+      </w:r>
+      <w:proofErr w:type="spellEnd"/>
     </w:p>
     <w:p/>
     <w:p>
@@ -201,8 +453,16 @@
         <w:rPr>
           <w:lang w:val="en-GB"/>
         </w:rPr>
-        <w:t>Repository Link and AI Satement</w:t>
-      </w:r>
+        <w:t xml:space="preserve">Repository Link and AI </w:t>
+      </w:r>
+      <w:proofErr w:type="spellStart"/>
+      <w:r>
+        <w:rPr>
+          <w:lang w:val="en-GB"/>
+        </w:rPr>
+        <w:t>Satement</w:t>
+      </w:r>
+      <w:proofErr w:type="spellEnd"/>
     </w:p>
     <w:p>
       <w:pPr>
@@ -228,7 +488,55 @@
             <w:rStyle w:val="Hyperlink"/>
             <w:lang w:val="en-GB"/>
           </w:rPr>
-          <w:t>ripy250/project_ri: Pyhton SDS210 Assesment Repository Riana Lüthi</w:t>
+          <w:t>ripy250/</w:t>
+        </w:r>
+        <w:proofErr w:type="spellStart"/>
+        <w:r>
+          <w:rPr>
+            <w:rStyle w:val="Hyperlink"/>
+            <w:lang w:val="en-GB"/>
+          </w:rPr>
+          <w:t>project_ri</w:t>
+        </w:r>
+        <w:proofErr w:type="spellEnd"/>
+        <w:r>
+          <w:rPr>
+            <w:rStyle w:val="Hyperlink"/>
+            <w:lang w:val="en-GB"/>
+          </w:rPr>
+          <w:t xml:space="preserve">: </w:t>
+        </w:r>
+        <w:proofErr w:type="spellStart"/>
+        <w:r>
+          <w:rPr>
+            <w:rStyle w:val="Hyperlink"/>
+            <w:lang w:val="en-GB"/>
+          </w:rPr>
+          <w:t>Pyhton</w:t>
+        </w:r>
+        <w:proofErr w:type="spellEnd"/>
+        <w:r>
+          <w:rPr>
+            <w:rStyle w:val="Hyperlink"/>
+            <w:lang w:val="en-GB"/>
+          </w:rPr>
+          <w:t xml:space="preserve"> SDS210 </w:t>
+        </w:r>
+        <w:proofErr w:type="spellStart"/>
+        <w:r>
+          <w:rPr>
+            <w:rStyle w:val="Hyperlink"/>
+            <w:lang w:val="en-GB"/>
+          </w:rPr>
+          <w:t>Assesment</w:t>
+        </w:r>
+        <w:proofErr w:type="spellEnd"/>
+        <w:r>
+          <w:rPr>
+            <w:rStyle w:val="Hyperlink"/>
+            <w:lang w:val="en-GB"/>
+          </w:rPr>
+          <w:t xml:space="preserve"> Repository Riana Lüthi</w:t>
         </w:r>
       </w:hyperlink>
     </w:p>
@@ -238,8 +546,13 @@
           <w:lang w:val="en-GB"/>
         </w:rPr>
       </w:pPr>
-      <w:r>
-        <w:t xml:space="preserve">AI Statement: </w:t>
+      <w:proofErr w:type="gramStart"/>
+      <w:r>
+        <w:t>AI Statement</w:t>
+      </w:r>
+      <w:proofErr w:type="gramEnd"/>
+      <w:r>
+        <w:t xml:space="preserve">: </w:t>
       </w:r>
     </w:p>
     <w:sectPr>
@@ -358,7 +671,7 @@
         <w:rFonts w:ascii="Aptos" w:eastAsiaTheme="minorHAnsi" w:hAnsi="Aptos" w:cstheme="minorBidi" w:hint="default"/>
       </w:rPr>
     </w:lvl>
-    <w:lvl w:ilvl="1" w:tplc="08070003" w:tentative="1">
+    <w:lvl w:ilvl="1" w:tplc="08070003">
       <w:start w:val="1"/>
       <w:numFmt w:val="bullet"/>
       <w:lvlText w:val="o"/>
@@ -1066,6 +1379,7 @@
   <w:style w:type="character" w:default="1" w:styleId="Absatz-Standardschriftart">
     <w:name w:val="Default Paragraph Font"/>
     <w:uiPriority w:val="1"/>
+    <w:semiHidden/>
     <w:unhideWhenUsed/>
   </w:style>
   <w:style w:type="table" w:default="1" w:styleId="NormaleTabelle">

</xml_diff>

<commit_message>
Update cleaning workflow and beginning of spatial analysis
</commit_message>
<xml_diff>
--- a/Individual_Project_Report_RL.docx
+++ b/Individual_Project_Report_RL.docx
@@ -205,11 +205,161 @@
     </w:p>
     <w:p>
       <w:pPr>
-        <w:rPr>
-          <w:b/>
-          <w:bCs/>
-        </w:rPr>
-      </w:pPr>
+        <w:pStyle w:val="Listenabsatz"/>
+        <w:numPr>
+          <w:ilvl w:val="0"/>
+          <w:numId w:val="2"/>
+        </w:numPr>
+      </w:pPr>
+      <w:proofErr w:type="spellStart"/>
+      <w:r>
+        <w:t>Service_request_id</w:t>
+      </w:r>
+      <w:proofErr w:type="spellEnd"/>
+      <w:r>
+        <w:t xml:space="preserve"> als </w:t>
+      </w:r>
+      <w:proofErr w:type="spellStart"/>
+      <w:r>
+        <w:t>index</w:t>
+      </w:r>
+      <w:proofErr w:type="spellEnd"/>
+      <w:r>
+        <w:t xml:space="preserve"> gesetzt, da</w:t>
+      </w:r>
+      <w:r>
+        <w:t xml:space="preserve"> es ein </w:t>
+      </w:r>
+      <w:proofErr w:type="spellStart"/>
+      <w:r>
+        <w:t>unique</w:t>
+      </w:r>
+      <w:proofErr w:type="spellEnd"/>
+      <w:r>
+        <w:t xml:space="preserve"> </w:t>
+      </w:r>
+      <w:proofErr w:type="spellStart"/>
+      <w:r>
+        <w:t>value</w:t>
+      </w:r>
+      <w:proofErr w:type="spellEnd"/>
+      <w:r>
+        <w:t xml:space="preserve"> war und </w:t>
+      </w:r>
+      <w:r>
+        <w:t xml:space="preserve">es weniger verwirrend sein sollte al ein </w:t>
+      </w:r>
+      <w:proofErr w:type="spellStart"/>
+      <w:r>
+        <w:t>ranodm</w:t>
+      </w:r>
+      <w:proofErr w:type="spellEnd"/>
+      <w:r>
+        <w:t xml:space="preserve"> </w:t>
+      </w:r>
+      <w:proofErr w:type="spellStart"/>
+      <w:r>
+        <w:t>index</w:t>
+      </w:r>
+      <w:proofErr w:type="spellEnd"/>
+      <w:r>
+        <w:t xml:space="preserve"> ab 0</w:t>
+      </w:r>
+    </w:p>
+    <w:p>
+      <w:pPr>
+        <w:pStyle w:val="Listenabsatz"/>
+        <w:numPr>
+          <w:ilvl w:val="1"/>
+          <w:numId w:val="2"/>
+        </w:numPr>
+      </w:pPr>
+      <w:r>
+        <w:t xml:space="preserve">Problem. </w:t>
+      </w:r>
+      <w:proofErr w:type="spellStart"/>
+      <w:r>
+        <w:t>Beimspeicher</w:t>
+      </w:r>
+      <w:proofErr w:type="spellEnd"/>
+      <w:r>
+        <w:t xml:space="preserve"> von </w:t>
+      </w:r>
+      <w:proofErr w:type="spellStart"/>
+      <w:r>
+        <w:t>CSv</w:t>
+      </w:r>
+      <w:proofErr w:type="spellEnd"/>
+      <w:r>
+        <w:t xml:space="preserve">, </w:t>
+      </w:r>
+      <w:proofErr w:type="spellStart"/>
+      <w:r>
+        <w:t>index</w:t>
+      </w:r>
+      <w:proofErr w:type="spellEnd"/>
+      <w:r>
+        <w:t xml:space="preserve"> = True </w:t>
+      </w:r>
+      <w:proofErr w:type="spellStart"/>
+      <w:r>
+        <w:t>zuerts</w:t>
+      </w:r>
+      <w:proofErr w:type="spellEnd"/>
+      <w:r>
+        <w:t xml:space="preserve"> </w:t>
+      </w:r>
+      <w:proofErr w:type="spellStart"/>
+      <w:r>
+        <w:t>snicht</w:t>
+      </w:r>
+      <w:proofErr w:type="spellEnd"/>
+      <w:r>
+        <w:t xml:space="preserve"> gehabt und </w:t>
+      </w:r>
+      <w:proofErr w:type="gramStart"/>
+      <w:r>
+        <w:t>beim laden</w:t>
+      </w:r>
+      <w:proofErr w:type="gramEnd"/>
+      <w:r>
+        <w:t xml:space="preserve"> in neuem </w:t>
+      </w:r>
+      <w:proofErr w:type="spellStart"/>
+      <w:r>
+        <w:t>notebook</w:t>
+      </w:r>
+      <w:proofErr w:type="spellEnd"/>
+      <w:r>
+        <w:t xml:space="preserve">, muss man den </w:t>
+      </w:r>
+      <w:proofErr w:type="spellStart"/>
+      <w:r>
+        <w:t>index</w:t>
+      </w:r>
+      <w:proofErr w:type="spellEnd"/>
+      <w:r>
+        <w:t xml:space="preserve"> explizit wieder angeben.</w:t>
+      </w:r>
+    </w:p>
+    <w:p>
+      <w:r>
+        <w:t>Forschungsfrage:</w:t>
+      </w:r>
+      <w:r>
+        <w:t xml:space="preserve"> </w:t>
+      </w:r>
+      <w:r>
+        <w:t xml:space="preserve">Welche räumlichen und zeitlichen Muster ergeben sich aus den Schadensmeldungen auf </w:t>
+      </w:r>
+      <w:proofErr w:type="spellStart"/>
+      <w:r>
+        <w:t>zueri</w:t>
+      </w:r>
+      <w:proofErr w:type="spellEnd"/>
+      <w:r>
+        <w:t xml:space="preserve"> wie neu?</w:t>
+      </w:r>
     </w:p>
     <w:p/>
     <w:p>
@@ -409,6 +559,58 @@
       <w:pPr>
         <w:pStyle w:val="Listenabsatz"/>
         <w:numPr>
+          <w:ilvl w:val="1"/>
+          <w:numId w:val="2"/>
+        </w:numPr>
+        <w:rPr>
+          <w:color w:val="EE0000"/>
+        </w:rPr>
+      </w:pPr>
+      <w:r>
+        <w:rPr>
+          <w:color w:val="EE0000"/>
+        </w:rPr>
+        <w:drawing>
+          <wp:inline distT="0" distB="0" distL="0" distR="0" wp14:anchorId="48AD84E3" wp14:editId="565E26C3">
+            <wp:extent cx="5760720" cy="922655"/>
+            <wp:effectExtent l="0" t="0" r="0" b="0"/>
+            <wp:docPr id="440982681" name="Grafik 1" descr="The image shows a snippet of a Python code snippet involving geopandas, reading a geopackage file, and a warning message regarding multiple layers in the geopackage.&#10;&#10;KI-generierte Inhalte können fehlerhaft sein."/>
+            <wp:cNvGraphicFramePr>
+              <a:graphicFrameLocks xmlns:a="http://schemas.openxmlformats.org/drawingml/2006/main" noChangeAspect="1"/>
+            </wp:cNvGraphicFramePr>
+            <a:graphic xmlns:a="http://schemas.openxmlformats.org/drawingml/2006/main">
+              <a:graphicData uri="http://schemas.openxmlformats.org/drawingml/2006/picture">
+                <pic:pic xmlns:pic="http://schemas.openxmlformats.org/drawingml/2006/picture">
+                  <pic:nvPicPr>
+                    <pic:cNvPr id="440982681" name="Grafik 1" descr="The image shows a snippet of a Python code snippet involving geopandas, reading a geopackage file, and a warning message regarding multiple layers in the geopackage.&#10;&#10;KI-generierte Inhalte können fehlerhaft sein."/>
+                    <pic:cNvPicPr/>
+                  </pic:nvPicPr>
+                  <pic:blipFill>
+                    <a:blip r:embed="rId5"/>
+                    <a:stretch>
+                      <a:fillRect/>
+                    </a:stretch>
+                  </pic:blipFill>
+                  <pic:spPr>
+                    <a:xfrm>
+                      <a:off x="0" y="0"/>
+                      <a:ext cx="5760720" cy="922655"/>
+                    </a:xfrm>
+                    <a:prstGeom prst="rect">
+                      <a:avLst/>
+                    </a:prstGeom>
+                  </pic:spPr>
+                </pic:pic>
+              </a:graphicData>
+            </a:graphic>
+          </wp:inline>
+        </w:drawing>
+      </w:r>
+    </w:p>
+    <w:p>
+      <w:pPr>
+        <w:pStyle w:val="Listenabsatz"/>
+        <w:numPr>
           <w:ilvl w:val="0"/>
           <w:numId w:val="1"/>
         </w:numPr>
@@ -474,6 +676,7 @@
         <w:rPr>
           <w:lang w:val="en-GB"/>
         </w:rPr>
+        <w:lastRenderedPageBreak/>
         <w:t>Re</w:t>
       </w:r>
       <w:r>
@@ -482,7 +685,7 @@
         </w:rPr>
         <w:t xml:space="preserve">pository Link: </w:t>
       </w:r>
-      <w:hyperlink r:id="rId5" w:history="1">
+      <w:hyperlink r:id="rId6" w:history="1">
         <w:r>
           <w:rPr>
             <w:rStyle w:val="Hyperlink"/>

</xml_diff>